<commit_message>
Feat: Update HD1 task - Combine push and monotonic_push method into single push
</commit_message>
<xml_diff>
--- a/Ontrack_Files/HD1/Monotonic Stack.docx
+++ b/Ontrack_Files/HD1/Monotonic Stack.docx
@@ -78,18 +78,18 @@
           <w:szCs w:val="23"/>
           <w14:ligatures w14:val="none"/>
         </w:rPr>
-        <w:t xml:space="preserve">A monotonic stack is a stack that maintains its elements in a monotonic order. My implementation uses a </w:t>
-      </w:r>
-      <w:r>
-        <w:rPr>
-          <w:rFonts w:ascii="Open Sans" w:eastAsia="Times New Roman" w:hAnsi="Open Sans" w:cs="Open Sans" w:hint="eastAsia"/>
+        <w:t xml:space="preserve">A monotonic stack is a stack that maintains its elements in a monotonic order. </w:t>
+      </w:r>
+      <w:r>
+        <w:rPr>
+          <w:rFonts w:ascii="Open Sans" w:eastAsia="Times New Roman" w:hAnsi="Open Sans" w:cs="Open Sans"/>
           <w:color w:val="222222"/>
           <w:kern w:val="0"/>
           <w:sz w:val="23"/>
           <w:szCs w:val="23"/>
           <w14:ligatures w14:val="none"/>
         </w:rPr>
-        <w:t>stack</w:t>
+        <w:t>My implementation uses a linked stack structure, where each Block stores the index, gate clearance, keycard clearance, and a pointer to the next block.</w:t>
       </w:r>
       <w:r>
         <w:rPr>
@@ -100,7 +100,7 @@
           <w:szCs w:val="23"/>
           <w14:ligatures w14:val="none"/>
         </w:rPr>
-        <w:t xml:space="preserve"> structure, where each Block stores the index of a gate and a pointer to the next block. The top pointer represents the top of the stack, so insertion and removal are performed only at the top.</w:t>
+        <w:t xml:space="preserve"> The top pointer represents the top of the stack, so insertion and removal are performed only at the top.</w:t>
       </w:r>
       <w:r>
         <w:rPr>
@@ -122,7 +122,18 @@
           <w:szCs w:val="23"/>
           <w14:ligatures w14:val="none"/>
         </w:rPr>
-        <w:t xml:space="preserve">In this problem, the stack stores the indices of gates that are still potential blockers. Before a new gate is pushed, gates with lower or equal clearance levels are removed if they are dominated by the new gate. </w:t>
+        <w:t>In this problem, the stack stores blocks representing gates that are still potential blockers.</w:t>
+      </w:r>
+      <w:r>
+        <w:rPr>
+          <w:rFonts w:ascii="Open Sans" w:eastAsia="Times New Roman" w:hAnsi="Open Sans" w:cs="Open Sans"/>
+          <w:color w:val="222222"/>
+          <w:kern w:val="0"/>
+          <w:sz w:val="23"/>
+          <w:szCs w:val="23"/>
+          <w14:ligatures w14:val="none"/>
+        </w:rPr>
+        <w:t xml:space="preserve"> Before a new gate is pushed, gates with lower or equal clearance levels are removed if they are dominated by the new gate. </w:t>
       </w:r>
       <w:r>
         <w:rPr>
@@ -209,7 +220,6 @@
         </w:rPr>
         <w:t xml:space="preserve"> </w:t>
       </w:r>
-      <w:proofErr w:type="gramStart"/>
       <w:r>
         <w:rPr>
           <w:rFonts w:ascii="Open Sans" w:eastAsia="Times New Roman" w:hAnsi="Open Sans" w:cs="Open Sans"/>
@@ -219,19 +229,7 @@
           <w:szCs w:val="23"/>
           <w14:ligatures w14:val="none"/>
         </w:rPr>
-        <w:t>A</w:t>
-      </w:r>
-      <w:proofErr w:type="gramEnd"/>
-      <w:r>
-        <w:rPr>
-          <w:rFonts w:ascii="Open Sans" w:eastAsia="Times New Roman" w:hAnsi="Open Sans" w:cs="Open Sans"/>
-          <w:color w:val="222222"/>
-          <w:kern w:val="0"/>
-          <w:sz w:val="23"/>
-          <w:szCs w:val="23"/>
-          <w14:ligatures w14:val="none"/>
-        </w:rPr>
-        <w:t xml:space="preserve"> monotonic queue could similarly maintain elements in monotonic order, but it would require operations at both ends. For this problem, only the most recent relevant blocker needs to be examined and removed, so the LIFO behaviour of a stack is sufficient and simpler.</w:t>
+        <w:t>A monotonic queue could similarly maintain elements in monotonic order, but it would require operations at both ends. For this problem, only the most recent relevant blocker needs to be examined and removed, so the LIFO behaviour of a stack is sufficient and simpler.</w:t>
       </w:r>
     </w:p>
     <w:p>
@@ -352,11 +350,6 @@
       </w:r>
     </w:p>
     <w:p>
-      <w:pPr>
-        <w:rPr>
-          <w:rFonts w:hint="eastAsia"/>
-        </w:rPr>
-      </w:pPr>
       <w:r>
         <w:rPr>
           <w:rFonts w:hint="eastAsia"/>

</xml_diff>